<commit_message>
Correct publication metadata across CV, site, and resume assets
Verified against Crossref and the published IEEE Access PDF:

- J1 (IEEE Access): remove Tasnim Ferdous, who is not an author of this
  paper; add page range pp. 32636-32660.
- C1 (ICEACE): add missing 5th author Himika Tasnim; add pp. 123-128 and
  doi 10.1109/ICEACE63551.2024.10898858.
- C2 (ICEACE): correct page range from 654-658 to 117-122; add
  doi 10.1109/ICEACE63551.2024.10898853.
- C3 (JCSSE): add pp. 638-643.
- Add conference locations (Changchun, China / Bangkok, Thailand).

Also add the HSC and SSC education entries to the site and print CV, and
fix the DOCX where those entries had been inserted inside a <w:pPr>
element, which caused Word to silently drop them.

CV PDF regenerated from resume.html; DOCX rebuilt from document.xml.

Co-Authored-By: Claude Opus 5 (1M context) <noreply@anthropic.com>
</commit_message>
<xml_diff>
--- a/assets/resume/AbrarSamin_CV.docx
+++ b/assets/resume/AbrarSamin_CV.docx
@@ -233,6 +233,126 @@
     </w:p>
     <w:p>
       <w:pPr>
+        <w:tabs>
+          <w:tab w:val="right" w:pos="9026"/>
+        </w:tabs>
+        <w:spacing w:after="40" w:before="140"/>
+      </w:pPr>
+      <w:r>
+        <w:rPr>
+          <w:b/>
+          <w:bCs/>
+          <w:sz w:val="22"/>
+          <w:szCs w:val="22"/>
+        </w:rPr>
+        <w:t xml:space="preserve">Government Science College</w:t>
+      </w:r>
+      <w:r>
+        <w:t xml:space="preserve">	</w:t>
+      </w:r>
+      <w:r>
+        <w:rPr>
+          <w:color w:val="595959"/>
+          <w:sz w:val="21"/>
+          <w:szCs w:val="21"/>
+        </w:rPr>
+        <w:t xml:space="preserve">Dhaka, Bangladesh</w:t>
+      </w:r>
+    </w:p>
+    <w:p>
+      <w:pPr>
+        <w:tabs>
+          <w:tab w:val="right" w:pos="9026"/>
+        </w:tabs>
+        <w:spacing w:after="40"/>
+      </w:pPr>
+      <w:r>
+        <w:t xml:space="preserve">Higher Secondary Certificate (HSC)</w:t>
+      </w:r>
+      <w:r>
+        <w:t xml:space="preserve">   —   </w:t>
+      </w:r>
+      <w:r>
+        <w:rPr>
+          <w:b/>
+          <w:bCs/>
+        </w:rPr>
+        <w:t xml:space="preserve">GPA: 5.00 / 5.00</w:t>
+      </w:r>
+      <w:r>
+        <w:t xml:space="preserve">	</w:t>
+      </w:r>
+      <w:r>
+        <w:rPr>
+          <w:color w:val="595959"/>
+          <w:sz w:val="21"/>
+          <w:szCs w:val="21"/>
+        </w:rPr>
+        <w:t xml:space="preserve">2019 – 2021</w:t>
+      </w:r>
+    </w:p>
+    <w:p>
+      <w:pPr>
+        <w:tabs>
+          <w:tab w:val="right" w:pos="9026"/>
+        </w:tabs>
+        <w:spacing w:after="40" w:before="140"/>
+      </w:pPr>
+      <w:r>
+        <w:rPr>
+          <w:b/>
+          <w:bCs/>
+          <w:sz w:val="22"/>
+          <w:szCs w:val="22"/>
+        </w:rPr>
+        <w:t xml:space="preserve">Adamjee Cantonment College</w:t>
+      </w:r>
+      <w:r>
+        <w:t xml:space="preserve">	</w:t>
+      </w:r>
+      <w:r>
+        <w:rPr>
+          <w:color w:val="595959"/>
+          <w:sz w:val="21"/>
+          <w:szCs w:val="21"/>
+        </w:rPr>
+        <w:t xml:space="preserve">Dhaka, Bangladesh</w:t>
+      </w:r>
+    </w:p>
+    <w:p>
+      <w:pPr>
+        <w:tabs>
+          <w:tab w:val="right" w:pos="9026"/>
+        </w:tabs>
+        <w:spacing w:after="40"/>
+      </w:pPr>
+      <w:r>
+        <w:t xml:space="preserve">Secondary School Certificate (SSC)</w:t>
+      </w:r>
+      <w:r>
+        <w:t xml:space="preserve">   —   </w:t>
+      </w:r>
+      <w:r>
+        <w:rPr>
+          <w:b/>
+          <w:bCs/>
+        </w:rPr>
+        <w:t xml:space="preserve">GPA: 5.00 / 5.00</w:t>
+      </w:r>
+      <w:r>
+        <w:t xml:space="preserve">	</w:t>
+      </w:r>
+      <w:r>
+        <w:rPr>
+          <w:color w:val="595959"/>
+          <w:sz w:val="21"/>
+          <w:szCs w:val="21"/>
+        </w:rPr>
+        <w:t xml:space="preserve">2017 – 2019</w:t>
+      </w:r>
+    </w:p>
+    <w:p>
+      <w:pPr>
         <w:pBdr>
           <w:bottom w:val="single" w:color="1F3864" w:sz="6" w:space="2"/>
         </w:pBdr>
@@ -269,7 +389,7 @@
         <w:t xml:space="preserve">Abrar Samin</w:t>
       </w:r>
       <w:r>
-        <w:t xml:space="preserve">, Tasnim Ferdous, Aniqua Nusrat Zereen, M. Abdullah-Al-Wadud, and Jia Uddin, </w:t>
+        <w:t xml:space="preserve">, Aniqua Nusrat Zereen, M. Abdullah-Al-Wadud, and Jia Uddin, </w:t>
       </w:r>
       <w:r>
         <w:t xml:space="preserve">“Optimizing Stroke Recognition with MediaPipe and Machine Learning: An Explainable AI Approach for Facial Landmark Analysis,” </w:t>
@@ -282,7 +402,7 @@
         <w:t xml:space="preserve">IEEE Access</w:t>
       </w:r>
       <w:r>
-        <w:t xml:space="preserve">, vol. 13, 2025, doi: 10.1109/ACCESS.2025.3550577.</w:t>
+        <w:t xml:space="preserve">, vol. 13, pp. 32636–32660, 2025, doi: 10.1109/ACCESS.2025.3550577.</w:t>
       </w:r>
     </w:p>
     <w:p>
@@ -305,7 +425,7 @@
         <w:t xml:space="preserve">Abrar Samin</w:t>
       </w:r>
       <w:r>
-        <w:t xml:space="preserve">, Sammam Mahdi, and Aniqua Nusrat Zereen, </w:t>
+        <w:t xml:space="preserve">, Sammam Mahdi, Himika Tasnim, and Aniqua Nusrat Zereen, </w:t>
       </w:r>
       <w:r>
         <w:t xml:space="preserve">“Machine Learning Approaches in Photoplethysmography-Based Sleep Stage Classification,” </w:t>
@@ -321,7 +441,7 @@
         <w:t xml:space="preserve">Proc. 2024 IEEE 2nd Int. Conf. on Electrical, Automation and Computer Engineering (ICEACE)</w:t>
       </w:r>
       <w:r>
-        <w:t xml:space="preserve">, Dec. 2024.</w:t>
+        <w:t xml:space="preserve">, Changchun, China, Dec. 2024, pp. 123–128, doi: 10.1109/ICEACE63551.2024.10898858.</w:t>
       </w:r>
     </w:p>
     <w:p>
@@ -360,15 +480,46 @@
         <w:t xml:space="preserve">Proc. 2024 IEEE 2nd Int. Conf. on Electrical, Automation and Computer Engineering (ICEACE)</w:t>
       </w:r>
       <w:r>
-        <w:t xml:space="preserve">, Dec. 2024, pp. 654–658.</w:t>
-      </w:r>
-    </w:p>
-    <w:p>
-      <w:pPr>
-        <w:spacing w:after="120"/>
-      </w:pPr>
-      <w:r>
-        <w:t xml:space="preserve">Sammam Mahdi, Reshad Ul Karim, Tareq Sujat, Syeda Maliha Tabassum, Abrar Samin, and Aniqua Nusrat Zereen, “Vision-based Hand Gesture Virtual Keyboard-Mouse framework with Bilingual Next-word prediction,” in Proc. 2026 23rd Int. Joint Conf. on Computer Science and Software Engineering (JCSSE), Jun. 2026, doi: 10.1109/JCSSE68839.2026.11596610.</w:t>
+        <w:t xml:space="preserve">, Changchun, China, Dec. 2024, pp. 117–122, doi: 10.1109/ICEACE63551.2024.10898853.</w:t>
+      </w:r>
+    </w:p>
+    <w:p>
+      <w:pPr>
+        <w:pStyle w:val="ListParagraph"/>
+        <w:numPr>
+          <w:ilvl w:val="0"/>
+          <w:numId w:val="2"/>
+        </w:numPr>
+        <w:spacing w:after="100"/>
+      </w:pPr>
+      <w:r>
+        <w:t xml:space="preserve">Sammam Mahdi, Reshad Ul Karim, Tareq Sujat, Syeda Maliha Tabassum, </w:t>
+      </w:r>
+      <w:r>
+        <w:rPr>
+          <w:b/>
+          <w:bCs/>
+        </w:rPr>
+        <w:t xml:space="preserve">Abrar Samin</w:t>
+      </w:r>
+      <w:r>
+        <w:t xml:space="preserve">, and Aniqua Nusrat Zereen, </w:t>
+      </w:r>
+      <w:r>
+        <w:t xml:space="preserve">“Vision-based Hand Gesture Virtual Keyboard-Mouse framework with Bilingual Next-word prediction,” </w:t>
+      </w:r>
+      <w:r>
+        <w:t xml:space="preserve">in </w:t>
+      </w:r>
+      <w:r>
+        <w:rPr>
+          <w:i/>
+          <w:iCs/>
+        </w:rPr>
+        <w:t xml:space="preserve">Proc. 2026 23rd Int. Joint Conf. on Computer Science and Software Engineering (JCSSE)</w:t>
+      </w:r>
+      <w:r>
+        <w:t xml:space="preserve">, Bangkok, Thailand, Jun. 2026, pp. 638–643, doi: 10.1109/JCSSE68839.2026.11596610.</w:t>
       </w:r>
     </w:p>
     <w:p>

</xml_diff>

<commit_message>
Remove HSC and SSC entries from site and CV
Drop the Government Science College (HSC) and Adamjee Cantonment
College (SSC) entries from the education timeline on the site, the
print CV, the DOCX, and the regenerated PDF. Education now lists only
the B.Sc. at BRAC University.

Co-Authored-By: Claude Opus 5 <noreply@anthropic.com>
</commit_message>
<xml_diff>
--- a/assets/resume/AbrarSamin_CV.docx
+++ b/assets/resume/AbrarSamin_CV.docx
@@ -229,126 +229,6 @@
           <w:szCs w:val="21"/>
         </w:rPr>
         <w:t xml:space="preserve">2022 – 2026</w:t>
-      </w:r>
-    </w:p>
-    <w:p>
-      <w:pPr>
-        <w:tabs>
-          <w:tab w:val="right" w:pos="9026"/>
-        </w:tabs>
-        <w:spacing w:after="40" w:before="140"/>
-      </w:pPr>
-      <w:r>
-        <w:rPr>
-          <w:b/>
-          <w:bCs/>
-          <w:sz w:val="22"/>
-          <w:szCs w:val="22"/>
-        </w:rPr>
-        <w:t xml:space="preserve">Government Science College</w:t>
-      </w:r>
-      <w:r>
-        <w:t xml:space="preserve">	</w:t>
-      </w:r>
-      <w:r>
-        <w:rPr>
-          <w:color w:val="595959"/>
-          <w:sz w:val="21"/>
-          <w:szCs w:val="21"/>
-        </w:rPr>
-        <w:t xml:space="preserve">Dhaka, Bangladesh</w:t>
-      </w:r>
-    </w:p>
-    <w:p>
-      <w:pPr>
-        <w:tabs>
-          <w:tab w:val="right" w:pos="9026"/>
-        </w:tabs>
-        <w:spacing w:after="40"/>
-      </w:pPr>
-      <w:r>
-        <w:t xml:space="preserve">Higher Secondary Certificate (HSC)</w:t>
-      </w:r>
-      <w:r>
-        <w:t xml:space="preserve">   —   </w:t>
-      </w:r>
-      <w:r>
-        <w:rPr>
-          <w:b/>
-          <w:bCs/>
-        </w:rPr>
-        <w:t xml:space="preserve">GPA: 5.00 / 5.00</w:t>
-      </w:r>
-      <w:r>
-        <w:t xml:space="preserve">	</w:t>
-      </w:r>
-      <w:r>
-        <w:rPr>
-          <w:color w:val="595959"/>
-          <w:sz w:val="21"/>
-          <w:szCs w:val="21"/>
-        </w:rPr>
-        <w:t xml:space="preserve">2019 – 2021</w:t>
-      </w:r>
-    </w:p>
-    <w:p>
-      <w:pPr>
-        <w:tabs>
-          <w:tab w:val="right" w:pos="9026"/>
-        </w:tabs>
-        <w:spacing w:after="40" w:before="140"/>
-      </w:pPr>
-      <w:r>
-        <w:rPr>
-          <w:b/>
-          <w:bCs/>
-          <w:sz w:val="22"/>
-          <w:szCs w:val="22"/>
-        </w:rPr>
-        <w:t xml:space="preserve">Adamjee Cantonment College</w:t>
-      </w:r>
-      <w:r>
-        <w:t xml:space="preserve">	</w:t>
-      </w:r>
-      <w:r>
-        <w:rPr>
-          <w:color w:val="595959"/>
-          <w:sz w:val="21"/>
-          <w:szCs w:val="21"/>
-        </w:rPr>
-        <w:t xml:space="preserve">Dhaka, Bangladesh</w:t>
-      </w:r>
-    </w:p>
-    <w:p>
-      <w:pPr>
-        <w:tabs>
-          <w:tab w:val="right" w:pos="9026"/>
-        </w:tabs>
-        <w:spacing w:after="40"/>
-      </w:pPr>
-      <w:r>
-        <w:t xml:space="preserve">Secondary School Certificate (SSC)</w:t>
-      </w:r>
-      <w:r>
-        <w:t xml:space="preserve">   —   </w:t>
-      </w:r>
-      <w:r>
-        <w:rPr>
-          <w:b/>
-          <w:bCs/>
-        </w:rPr>
-        <w:t xml:space="preserve">GPA: 5.00 / 5.00</w:t>
-      </w:r>
-      <w:r>
-        <w:t xml:space="preserve">	</w:t>
-      </w:r>
-      <w:r>
-        <w:rPr>
-          <w:color w:val="595959"/>
-          <w:sz w:val="21"/>
-          <w:szCs w:val="21"/>
-        </w:rPr>
-        <w:t xml:space="preserve">2017 – 2019</w:t>
       </w:r>
     </w:p>
     <w:p>

</xml_diff>

<commit_message>
Name the courses taught at DIU and close the TA role in Feb 2026
Replace the generic "undergraduate courses in software engineering and
computing" with the three courses actually taught, each with its lab:
Software Quality Assurance Testing (SE312), Data Structure (SE131), and
Algorithm Analysis (SE214). The site's experience card lists them as
tags; the CV lists them in Academic Appointments.

The BRAC teaching-assistant role now ends Feb 2026 rather than an
unqualified 2026.

Co-Authored-By: Claude Opus 5 <noreply@anthropic.com>
</commit_message>
<xml_diff>
--- a/assets/resume/AbrarSamin_CV.docx
+++ b/assets/resume/AbrarSamin_CV.docx
@@ -216,10 +216,28 @@
     </w:p>
     <w:p>
       <w:pPr>
-        <w:spacing w:after="60"/>
-      </w:pPr>
-      <w:r>
-        <w:t xml:space="preserve">Faculty member teaching undergraduate courses in software engineering and computing, while continuing research in machine learning, computer vision, and explainable AI.</w:t>
+        <w:pStyle w:val="ListParagraph"/>
+        <w:numPr>
+          <w:ilvl w:val="0"/>
+          <w:numId w:val="3"/>
+        </w:numPr>
+        <w:spacing w:after="30"/>
+      </w:pPr>
+      <w:r>
+        <w:t xml:space="preserve">Teaching three undergraduate courses with their accompanying laboratory sections: Software Quality Assurance Testing (SE312), Data Structure (SE131), and Algorithm Analysis (SE214).</w:t>
+      </w:r>
+    </w:p>
+    <w:p>
+      <w:pPr>
+        <w:pStyle w:val="ListParagraph"/>
+        <w:numPr>
+          <w:ilvl w:val="0"/>
+          <w:numId w:val="3"/>
+        </w:numPr>
+        <w:spacing w:after="30"/>
+      </w:pPr>
+      <w:r>
+        <w:t xml:space="preserve">Continuing research in machine learning, computer vision, and explainable AI alongside teaching.</w:t>
       </w:r>
     </w:p>
     <w:p>
@@ -514,7 +532,7 @@
           <w:sz w:val="21"/>
           <w:szCs w:val="21"/>
         </w:rPr>
-        <w:t xml:space="preserve">2024 – 2026</w:t>
+        <w:t xml:space="preserve">2024 – Feb. 2026</w:t>
       </w:r>
     </w:p>
     <w:p>

</xml_diff>